<commit_message>
Bổ sung kế hoạch tuần 3 và SHA commit vào báo cáo
</commit_message>
<xml_diff>
--- a/docs/week2/BaoCaoTuan2.docx
+++ b/docs/week2/BaoCaoTuan2.docx
@@ -5795,8 +5795,6 @@
         </w:rPr>
         <w:t>--stack-name textract-full --parameter-overrides</w:t>
       </w:r>
-      <w:bookmarkStart w:id="18" w:name="_GoBack"/>
-      <w:bookmarkEnd w:id="18"/>
     </w:p>
     <w:p>
       <w:pPr>
@@ -8468,6 +8466,109 @@
     </w:p>
     <w:p>
       <w:pPr>
+        <w:pStyle w:val="3"/>
+        <w:ind w:firstLine="720" w:firstLineChars="0"/>
+        <w:rPr>
+          <w:rFonts w:hint="default" w:ascii="Times New Roman" w:hAnsi="Times New Roman" w:cs="Times New Roman"/>
+          <w:color w:val="auto"/>
+          <w:sz w:val="26"/>
+          <w:szCs w:val="26"/>
+        </w:rPr>
+      </w:pPr>
+      <w:bookmarkStart w:id="18" w:name="_GoBack"/>
+      <w:bookmarkEnd w:id="18"/>
+      <w:r>
+        <w:rPr>
+          <w:rFonts w:hint="default" w:ascii="Times New Roman" w:hAnsi="Times New Roman" w:cs="Times New Roman"/>
+          <w:color w:val="auto"/>
+          <w:sz w:val="26"/>
+          <w:szCs w:val="26"/>
+        </w:rPr>
+        <w:t>Kế hoạch tuần 3</w:t>
+      </w:r>
+    </w:p>
+    <w:p>
+      <w:pPr>
+        <w:pStyle w:val="25"/>
+        <w:rPr>
+          <w:rFonts w:hint="default" w:ascii="Times New Roman" w:hAnsi="Times New Roman" w:cs="Times New Roman"/>
+          <w:color w:val="auto"/>
+          <w:sz w:val="26"/>
+          <w:szCs w:val="26"/>
+        </w:rPr>
+      </w:pPr>
+      <w:r>
+        <w:rPr>
+          <w:rFonts w:hint="default" w:ascii="Times New Roman" w:hAnsi="Times New Roman" w:cs="Times New Roman"/>
+          <w:color w:val="auto"/>
+          <w:sz w:val="26"/>
+          <w:szCs w:val="26"/>
+        </w:rPr>
+        <w:t>Chạy pipeline với bộ ít nhất 30 tài liệu mẫu có dữ liệu chuẩn (ground truth) để đánh giá kết quả trích xuất trên Textract thật.</w:t>
+      </w:r>
+    </w:p>
+    <w:p>
+      <w:pPr>
+        <w:pStyle w:val="25"/>
+        <w:rPr>
+          <w:rFonts w:hint="default" w:ascii="Times New Roman" w:hAnsi="Times New Roman" w:cs="Times New Roman"/>
+          <w:color w:val="auto"/>
+          <w:sz w:val="26"/>
+          <w:szCs w:val="26"/>
+        </w:rPr>
+      </w:pPr>
+      <w:r>
+        <w:rPr>
+          <w:rFonts w:hint="default" w:ascii="Times New Roman" w:hAnsi="Times New Roman" w:cs="Times New Roman"/>
+          <w:color w:val="auto"/>
+          <w:sz w:val="26"/>
+          <w:szCs w:val="26"/>
+        </w:rPr>
+        <w:t>Đối chiếu kết quả với ground truth, tổng hợp độ chính xác theo loại tài liệu và nhóm trường, rồi lưu kết quả đánh giá làm minh chứng.</w:t>
+      </w:r>
+    </w:p>
+    <w:p>
+      <w:pPr>
+        <w:pStyle w:val="25"/>
+        <w:rPr>
+          <w:rFonts w:hint="default" w:ascii="Times New Roman" w:hAnsi="Times New Roman" w:cs="Times New Roman"/>
+          <w:color w:val="auto"/>
+          <w:sz w:val="26"/>
+          <w:szCs w:val="26"/>
+        </w:rPr>
+      </w:pPr>
+      <w:r>
+        <w:rPr>
+          <w:rFonts w:hint="default" w:ascii="Times New Roman" w:hAnsi="Times New Roman" w:cs="Times New Roman"/>
+          <w:color w:val="auto"/>
+          <w:sz w:val="26"/>
+          <w:szCs w:val="26"/>
+        </w:rPr>
+        <w:t>Phân tích các trường hợp trích xuất sai, hoàn thiện chuẩn hóa dữ liệu nếu cần và bổ sung kiểm thử hồi quy cho các lỗi đã tìm thấy.</w:t>
+      </w:r>
+    </w:p>
+    <w:p>
+      <w:pPr>
+        <w:pStyle w:val="25"/>
+        <w:rPr>
+          <w:rFonts w:hint="default" w:ascii="Times New Roman" w:hAnsi="Times New Roman" w:cs="Times New Roman"/>
+          <w:color w:val="auto"/>
+          <w:sz w:val="26"/>
+          <w:szCs w:val="26"/>
+        </w:rPr>
+      </w:pPr>
+      <w:r>
+        <w:rPr>
+          <w:rFonts w:hint="default" w:ascii="Times New Roman" w:hAnsi="Times New Roman" w:cs="Times New Roman"/>
+          <w:color w:val="auto"/>
+          <w:sz w:val="26"/>
+          <w:szCs w:val="26"/>
+        </w:rPr>
+        <w:t>Cập nhật báo cáo kết quả, giới hạn của bộ dữ liệu, độ chính xác và chi phí AWS ghi nhận được.</w:t>
+      </w:r>
+    </w:p>
+    <w:p>
+      <w:pPr>
         <w:spacing w:after="0" w:line="360" w:lineRule="auto"/>
         <w:ind w:firstLine="720"/>
         <w:jc w:val="both"/>
@@ -8481,6 +8582,7 @@
       <w:r>
         <w:rPr>
           <w:rFonts w:hint="default" w:ascii="Times New Roman" w:hAnsi="Times New Roman" w:cs="Times New Roman"/>
+          <w:color w:val="auto"/>
           <w:sz w:val="26"/>
           <w:szCs w:val="26"/>
         </w:rPr>
@@ -8541,7 +8643,7 @@
     <w:sdtPr>
       <w:id w:val="-459349896"/>
       <w:docPartObj>
-        <w:docPartGallery w:val="AutoText"/>
+        <w:docPartGallery w:val="autotext"/>
       </w:docPartObj>
     </w:sdtPr>
     <w:sdtContent>
@@ -8914,20 +9016,20 @@
     <w:lsdException w:uiPriority="99" w:name="endnote reference"/>
     <w:lsdException w:uiPriority="99" w:name="endnote text"/>
     <w:lsdException w:uiPriority="99" w:name="table of authorities"/>
-    <w:lsdException w:uiPriority="99" w:semiHidden="0" w:name="macro"/>
+    <w:lsdException w:qFormat="1" w:uiPriority="99" w:semiHidden="0" w:name="macro"/>
     <w:lsdException w:uiPriority="99" w:name="toa heading"/>
     <w:lsdException w:qFormat="1" w:uiPriority="99" w:semiHidden="0" w:name="List"/>
     <w:lsdException w:uiPriority="99" w:semiHidden="0" w:name="List Bullet"/>
-    <w:lsdException w:uiPriority="99" w:semiHidden="0" w:name="List Number"/>
+    <w:lsdException w:qFormat="1" w:uiPriority="99" w:semiHidden="0" w:name="List Number"/>
     <w:lsdException w:qFormat="1" w:uiPriority="99" w:semiHidden="0" w:name="List 2"/>
     <w:lsdException w:qFormat="1" w:uiPriority="99" w:semiHidden="0" w:name="List 3"/>
     <w:lsdException w:uiPriority="99" w:name="List 4"/>
     <w:lsdException w:uiPriority="99" w:name="List 5"/>
-    <w:lsdException w:uiPriority="99" w:semiHidden="0" w:name="List Bullet 2"/>
-    <w:lsdException w:uiPriority="99" w:semiHidden="0" w:name="List Bullet 3"/>
+    <w:lsdException w:qFormat="1" w:uiPriority="99" w:semiHidden="0" w:name="List Bullet 2"/>
+    <w:lsdException w:qFormat="1" w:uiPriority="99" w:semiHidden="0" w:name="List Bullet 3"/>
     <w:lsdException w:uiPriority="99" w:name="List Bullet 4"/>
     <w:lsdException w:uiPriority="99" w:name="List Bullet 5"/>
-    <w:lsdException w:uiPriority="99" w:semiHidden="0" w:name="List Number 2"/>
+    <w:lsdException w:qFormat="1" w:uiPriority="99" w:semiHidden="0" w:name="List Number 2"/>
     <w:lsdException w:uiPriority="99" w:semiHidden="0" w:name="List Number 3"/>
     <w:lsdException w:uiPriority="99" w:name="List Number 4"/>
     <w:lsdException w:uiPriority="99" w:name="List Number 5"/>
@@ -8937,9 +9039,9 @@
     <w:lsdException w:qFormat="1" w:uiPriority="1" w:semiHidden="0" w:name="Default Paragraph Font"/>
     <w:lsdException w:qFormat="1" w:uiPriority="99" w:semiHidden="0" w:name="Body Text"/>
     <w:lsdException w:uiPriority="99" w:name="Body Text Indent"/>
-    <w:lsdException w:uiPriority="99" w:semiHidden="0" w:name="List Continue"/>
-    <w:lsdException w:uiPriority="99" w:semiHidden="0" w:name="List Continue 2"/>
-    <w:lsdException w:uiPriority="99" w:semiHidden="0" w:name="List Continue 3"/>
+    <w:lsdException w:qFormat="1" w:uiPriority="99" w:semiHidden="0" w:name="List Continue"/>
+    <w:lsdException w:qFormat="1" w:uiPriority="99" w:semiHidden="0" w:name="List Continue 2"/>
+    <w:lsdException w:qFormat="1" w:uiPriority="99" w:semiHidden="0" w:name="List Continue 3"/>
     <w:lsdException w:uiPriority="99" w:name="List Continue 4"/>
     <w:lsdException w:uiPriority="99" w:name="List Continue 5"/>
     <w:lsdException w:uiPriority="99" w:name="Message Header"/>
@@ -8949,12 +9051,12 @@
     <w:lsdException w:uiPriority="99" w:name="Body Text First Indent"/>
     <w:lsdException w:uiPriority="99" w:name="Body Text First Indent 2"/>
     <w:lsdException w:uiPriority="99" w:name="Note Heading"/>
-    <w:lsdException w:uiPriority="99" w:semiHidden="0" w:name="Body Text 2"/>
+    <w:lsdException w:qFormat="1" w:uiPriority="99" w:semiHidden="0" w:name="Body Text 2"/>
     <w:lsdException w:qFormat="1" w:uiPriority="99" w:semiHidden="0" w:name="Body Text 3"/>
     <w:lsdException w:uiPriority="99" w:name="Body Text Indent 2"/>
     <w:lsdException w:uiPriority="99" w:name="Body Text Indent 3"/>
     <w:lsdException w:uiPriority="99" w:name="Block Text"/>
-    <w:lsdException w:uiPriority="99" w:semiHidden="0" w:name="Hyperlink"/>
+    <w:lsdException w:qFormat="1" w:uiPriority="99" w:semiHidden="0" w:name="Hyperlink"/>
     <w:lsdException w:uiPriority="99" w:name="FollowedHyperlink"/>
     <w:lsdException w:qFormat="1" w:unhideWhenUsed="0" w:uiPriority="22" w:semiHidden="0" w:name="Strong"/>
     <w:lsdException w:qFormat="1" w:unhideWhenUsed="0" w:uiPriority="20" w:semiHidden="0" w:name="Emphasis"/>
@@ -8965,7 +9067,7 @@
     <w:lsdException w:uiPriority="99" w:name="HTML Acronym"/>
     <w:lsdException w:uiPriority="99" w:name="HTML Address"/>
     <w:lsdException w:uiPriority="99" w:name="HTML Cite"/>
-    <w:lsdException w:uiPriority="99" w:name="HTML Code"/>
+    <w:lsdException w:qFormat="1" w:uiPriority="99" w:name="HTML Code"/>
     <w:lsdException w:uiPriority="99" w:name="HTML Definition"/>
     <w:lsdException w:uiPriority="99" w:name="HTML Keyboard"/>
     <w:lsdException w:uiPriority="99" w:name="HTML Preformatted"/>
@@ -9025,7 +9127,7 @@
     <w:lsdException w:unhideWhenUsed="0" w:uiPriority="62" w:semiHidden="0" w:name="Light Grid"/>
     <w:lsdException w:unhideWhenUsed="0" w:uiPriority="63" w:semiHidden="0" w:name="Medium Shading 1"/>
     <w:lsdException w:unhideWhenUsed="0" w:uiPriority="64" w:semiHidden="0" w:name="Medium Shading 2"/>
-    <w:lsdException w:unhideWhenUsed="0" w:uiPriority="65" w:semiHidden="0" w:name="Medium List 1"/>
+    <w:lsdException w:qFormat="1" w:unhideWhenUsed="0" w:uiPriority="65" w:semiHidden="0" w:name="Medium List 1"/>
     <w:lsdException w:unhideWhenUsed="0" w:uiPriority="66" w:semiHidden="0" w:name="Medium List 2"/>
     <w:lsdException w:unhideWhenUsed="0" w:uiPriority="67" w:semiHidden="0" w:name="Medium Grid 1"/>
     <w:lsdException w:unhideWhenUsed="0" w:uiPriority="68" w:semiHidden="0" w:name="Medium Grid 2"/>
@@ -9055,10 +9157,10 @@
     <w:lsdException w:unhideWhenUsed="0" w:uiPriority="61" w:semiHidden="0" w:name="Light List Accent 2"/>
     <w:lsdException w:unhideWhenUsed="0" w:uiPriority="62" w:semiHidden="0" w:name="Light Grid Accent 2"/>
     <w:lsdException w:unhideWhenUsed="0" w:uiPriority="63" w:semiHidden="0" w:name="Medium Shading 1 Accent 2"/>
-    <w:lsdException w:unhideWhenUsed="0" w:uiPriority="64" w:semiHidden="0" w:name="Medium Shading 2 Accent 2"/>
+    <w:lsdException w:qFormat="1" w:unhideWhenUsed="0" w:uiPriority="64" w:semiHidden="0" w:name="Medium Shading 2 Accent 2"/>
     <w:lsdException w:unhideWhenUsed="0" w:uiPriority="65" w:semiHidden="0" w:name="Medium List 1 Accent 2"/>
     <w:lsdException w:unhideWhenUsed="0" w:uiPriority="66" w:semiHidden="0" w:name="Medium List 2 Accent 2"/>
-    <w:lsdException w:unhideWhenUsed="0" w:uiPriority="67" w:semiHidden="0" w:name="Medium Grid 1 Accent 2"/>
+    <w:lsdException w:qFormat="1" w:unhideWhenUsed="0" w:uiPriority="67" w:semiHidden="0" w:name="Medium Grid 1 Accent 2"/>
     <w:lsdException w:unhideWhenUsed="0" w:uiPriority="68" w:semiHidden="0" w:name="Medium Grid 2 Accent 2"/>
     <w:lsdException w:unhideWhenUsed="0" w:uiPriority="69" w:semiHidden="0" w:name="Medium Grid 3 Accent 2"/>
     <w:lsdException w:unhideWhenUsed="0" w:uiPriority="70" w:semiHidden="0" w:name="Dark List Accent 2"/>
@@ -9403,6 +9505,7 @@
     <w:basedOn w:val="1"/>
     <w:link w:val="150"/>
     <w:unhideWhenUsed/>
+    <w:qFormat/>
     <w:uiPriority w:val="99"/>
     <w:pPr>
       <w:spacing w:after="120" w:line="480" w:lineRule="auto"/>
@@ -9492,6 +9595,7 @@
     <w:basedOn w:val="11"/>
     <w:semiHidden/>
     <w:unhideWhenUsed/>
+    <w:qFormat/>
     <w:uiPriority w:val="99"/>
     <w:rPr>
       <w:rFonts w:ascii="Courier New" w:hAnsi="Courier New" w:cs="Courier New"/>
@@ -9503,6 +9607,7 @@
     <w:name w:val="Hyperlink"/>
     <w:basedOn w:val="11"/>
     <w:unhideWhenUsed/>
+    <w:qFormat/>
     <w:uiPriority w:val="99"/>
     <w:rPr>
       <w:color w:val="0000FF" w:themeColor="hyperlink"/>
@@ -9564,6 +9669,7 @@
     <w:name w:val="List Bullet 2"/>
     <w:basedOn w:val="1"/>
     <w:unhideWhenUsed/>
+    <w:qFormat/>
     <w:uiPriority w:val="99"/>
     <w:pPr>
       <w:numPr>
@@ -9577,6 +9683,7 @@
     <w:name w:val="List Bullet 3"/>
     <w:basedOn w:val="1"/>
     <w:unhideWhenUsed/>
+    <w:qFormat/>
     <w:uiPriority w:val="99"/>
     <w:pPr>
       <w:numPr>
@@ -9590,6 +9697,7 @@
     <w:name w:val="List Continue"/>
     <w:basedOn w:val="1"/>
     <w:unhideWhenUsed/>
+    <w:qFormat/>
     <w:uiPriority w:val="99"/>
     <w:pPr>
       <w:spacing w:after="120"/>
@@ -9601,6 +9709,7 @@
     <w:name w:val="List Continue 2"/>
     <w:basedOn w:val="1"/>
     <w:unhideWhenUsed/>
+    <w:qFormat/>
     <w:uiPriority w:val="99"/>
     <w:pPr>
       <w:spacing w:after="120"/>
@@ -9612,6 +9721,7 @@
     <w:name w:val="List Continue 3"/>
     <w:basedOn w:val="1"/>
     <w:unhideWhenUsed/>
+    <w:qFormat/>
     <w:uiPriority w:val="99"/>
     <w:pPr>
       <w:spacing w:after="120"/>
@@ -9623,6 +9733,7 @@
     <w:name w:val="List Number"/>
     <w:basedOn w:val="1"/>
     <w:unhideWhenUsed/>
+    <w:qFormat/>
     <w:uiPriority w:val="99"/>
     <w:pPr>
       <w:numPr>
@@ -9636,6 +9747,7 @@
     <w:name w:val="List Number 2"/>
     <w:basedOn w:val="1"/>
     <w:unhideWhenUsed/>
+    <w:qFormat/>
     <w:uiPriority w:val="99"/>
     <w:pPr>
       <w:numPr>
@@ -9662,6 +9774,7 @@
     <w:name w:val="macro"/>
     <w:link w:val="152"/>
     <w:unhideWhenUsed/>
+    <w:qFormat/>
     <w:uiPriority w:val="99"/>
     <w:pPr>
       <w:tabs>
@@ -9693,6 +9806,7 @@
       <w:jc w:val="left"/>
     </w:pPr>
     <w:rPr>
+      <w:rFonts w:ascii="Times New Roman" w:hAnsi="Times New Roman" w:eastAsia="SimSun" w:cs="Times New Roman"/>
       <w:kern w:val="0"/>
       <w:sz w:val="24"/>
       <w:szCs w:val="24"/>
@@ -12918,6 +13032,7 @@
   <w:style w:type="table" w:styleId="72">
     <w:name w:val="Medium Shading 2 Accent 2"/>
     <w:basedOn w:val="12"/>
+    <w:qFormat/>
     <w:uiPriority w:val="64"/>
     <w:pPr>
       <w:spacing w:after="0" w:line="240" w:lineRule="auto"/>
@@ -13713,6 +13828,7 @@
   <w:style w:type="table" w:styleId="77">
     <w:name w:val="Medium List 1"/>
     <w:basedOn w:val="12"/>
+    <w:qFormat/>
     <w:uiPriority w:val="65"/>
     <w:pPr>
       <w:spacing w:after="0" w:line="240" w:lineRule="auto"/>
@@ -15289,6 +15405,7 @@
   <w:style w:type="table" w:styleId="93">
     <w:name w:val="Medium Grid 1 Accent 2"/>
     <w:basedOn w:val="12"/>
+    <w:qFormat/>
     <w:uiPriority w:val="67"/>
     <w:pPr>
       <w:spacing w:after="0" w:line="240" w:lineRule="auto"/>

</xml_diff>